<commit_message>
Major UI overhaul: Enhanced trends.html, about.html, and other pages with modern teal theme (#008b8b, #30e3ca), CSS animations, glassmorphism effects, improved file download functionality, and removed backup files
</commit_message>
<xml_diff>
--- a/VitaCare_Pro_Project_Report.docx
+++ b/VitaCare_Pro_Project_Report.docx
@@ -51,8 +51,6 @@
         </w:rPr>
         <w:t>DSA Course Project - Final Documentation</w:t>
       </w:r>
-      <w:bookmarkStart w:id="0" w:name="_GoBack"/>
-      <w:bookmarkEnd w:id="0"/>
     </w:p>
     <w:p/>
     <w:p/>
@@ -225,10 +223,7 @@
               <w:cnfStyle w:val="000000100000" w:firstRow="0" w:lastRow="0" w:firstColumn="0" w:lastColumn="0" w:oddVBand="0" w:evenVBand="0" w:oddHBand="1" w:evenHBand="0" w:firstRowFirstColumn="0" w:firstRowLastColumn="0" w:lastRowFirstColumn="0" w:lastRowLastColumn="0"/>
             </w:pPr>
             <w:r>
-              <w:t xml:space="preserve">Bisma </w:t>
-            </w:r>
-            <w:r>
-              <w:t>Shahid</w:t>
+              <w:t>Bisma Shahid</w:t>
             </w:r>
           </w:p>
         </w:tc>
@@ -362,10 +357,7 @@
         <w:ind w:left="360"/>
       </w:pPr>
       <w:r>
-        <w:t>7.</w:t>
-      </w:r>
-      <w:r>
-        <w:t xml:space="preserve"> Conclusion</w:t>
+        <w:t>7. Conclusion</w:t>
       </w:r>
     </w:p>
     <w:p>
@@ -388,10 +380,7 @@
     </w:p>
     <w:p>
       <w:r>
-        <w:t>VitaCare Pro is a comprehensive hospital management and disease detection system that demonstrates the practical application of Data Structures and Algorithms (DSA) in machine learning and medical diagnosis. This project showc</w:t>
-      </w:r>
-      <w:r>
-        <w:t>ases how fundamental DSA concepts can be leveraged to build efficient, scalable medical prediction systems without relying entirely on traditional ML libraries.</w:t>
+        <w:t>VitaCare Pro is a comprehensive hospital management and disease detection system that demonstrates the practical application of Data Structures and Algorithms (DSA) in machine learning and medical diagnosis. This project showcases how fundamental DSA concepts can be leveraged to build efficient, scalable medical prediction systems without relying entirely on traditional ML libraries.</w:t>
       </w:r>
     </w:p>
     <w:p>
@@ -408,10 +397,7 @@
     </w:p>
     <w:p>
       <w:r>
-        <w:t>The system integrates multiple cutting-edge technologies to deliver a complete</w:t>
-      </w:r>
-      <w:r>
-        <w:t xml:space="preserve"> healthcare solution:</w:t>
+        <w:t>The system integrates multiple cutting-edge technologies to deliver a complete healthcare solution:</w:t>
       </w:r>
       <w:r>
         <w:br/>
@@ -462,10 +448,7 @@
         <w:pStyle w:val="ListBullet"/>
       </w:pPr>
       <w:r>
-        <w:t>Build decision tree-based ML mo</w:t>
-      </w:r>
-      <w:r>
-        <w:t>dels using C++ backend</w:t>
+        <w:t>Build decision tree-based ML models using C++ backend</w:t>
       </w:r>
     </w:p>
     <w:p>
@@ -509,13 +492,7 @@
         <w:rPr>
           <w:b/>
         </w:rPr>
-        <w:t>Afshal Liaquat (Group Lea</w:t>
-      </w:r>
-      <w:r>
-        <w:rPr>
-          <w:b/>
-        </w:rPr>
-        <w:t>der)</w:t>
+        <w:t>Afshal Liaquat (Group Leader)</w:t>
       </w:r>
       <w:r>
         <w:rPr>
@@ -553,10 +530,7 @@
       </w:r>
       <w:r>
         <w:br/>
-        <w:t xml:space="preserve">Responsibilities: Decision tree implementation, core DSA </w:t>
-      </w:r>
-      <w:r>
-        <w:t>structures, Python-C++ integration, Flask web application, complete UI design</w:t>
+        <w:t>Responsibilities: Decision tree implementation, core DSA structures, Python-C++ integration, Flask web application, complete UI design</w:t>
       </w:r>
       <w:r>
         <w:br/>
@@ -599,14 +573,7 @@
           <w:sz w:val="36"/>
         </w:rPr>
         <w:lastRenderedPageBreak/>
-        <w:t xml:space="preserve">2. </w:t>
-      </w:r>
-      <w:r>
-        <w:rPr>
-          <w:color w:val="003366"/>
-          <w:sz w:val="36"/>
-        </w:rPr>
-        <w:t>Project Features</w:t>
+        <w:t>2. Project Features</w:t>
       </w:r>
     </w:p>
     <w:p>
@@ -658,10 +625,7 @@
         <w:pStyle w:val="ListBullet"/>
       </w:pPr>
       <w:r>
-        <w:t xml:space="preserve">Password </w:t>
-      </w:r>
-      <w:r>
-        <w:t>migration from legacy SHA256 to modern double-hash scheme</w:t>
+        <w:t>Password migration from legacy SHA256 to modern double-hash scheme</w:t>
       </w:r>
     </w:p>
     <w:p>
@@ -693,10 +657,7 @@
         <w:pStyle w:val="ListBullet"/>
       </w:pPr>
       <w:r>
-        <w:t>Medical test management with automatic</w:t>
-      </w:r>
-      <w:r>
-        <w:t xml:space="preserve"> file handling</w:t>
+        <w:t>Medical test management with automatic file handling</w:t>
       </w:r>
     </w:p>
     <w:p>
@@ -736,10 +697,7 @@
         <w:pStyle w:val="ListBullet"/>
       </w:pPr>
       <w:r>
-        <w:t>Risk assessment with comp</w:t>
-      </w:r>
-      <w:r>
-        <w:t>osite scoring algorithms</w:t>
+        <w:t>Risk assessment with composite scoring algorithms</w:t>
       </w:r>
     </w:p>
     <w:p>
@@ -799,14 +757,7 @@
           <w:color w:val="003366"/>
           <w:sz w:val="28"/>
         </w:rPr>
-        <w:t>2</w:t>
-      </w:r>
-      <w:r>
-        <w:rPr>
-          <w:color w:val="003366"/>
-          <w:sz w:val="28"/>
-        </w:rPr>
-        <w:t>.2 System Architecture Features</w:t>
+        <w:t>2.2 System Architecture Features</w:t>
       </w:r>
     </w:p>
     <w:p>
@@ -928,10 +879,7 @@
           </w:tcPr>
           <w:p>
             <w:r>
-              <w:t xml:space="preserve">Priority Queue </w:t>
-            </w:r>
-            <w:r>
-              <w:t>(Max-Heap)</w:t>
+              <w:t>Priority Queue (Max-Heap)</w:t>
             </w:r>
           </w:p>
         </w:tc>
@@ -1253,10 +1201,7 @@
         <w:pStyle w:val="ListBullet"/>
       </w:pPr>
       <w:r>
-        <w:t>Disease thr</w:t>
-      </w:r>
-      <w:r>
-        <w:t>esholds for risk classification</w:t>
+        <w:t>Disease thresholds for risk classification</w:t>
       </w:r>
     </w:p>
     <w:p>
@@ -1307,13 +1252,7 @@
     </w:p>
     <w:p>
       <w:r>
-        <w:t xml:space="preserve">The decision tree is implemented as a recursive binary tree </w:t>
-      </w:r>
-      <w:r>
-        <w:t>structure where each node contains essential information for classification. Each node has a flag indicating whether it is a leaf node, stores the prediction value for classification output, identifies which feature to split on, maintains the split thresho</w:t>
-      </w:r>
-      <w:r>
-        <w:t>ld value, and contains pointers to left and right subtrees for values less than or equal to, and greater than the threshold respectively.</w:t>
+        <w:t>The decision tree is implemented as a recursive binary tree structure where each node contains essential information for classification. Each node has a flag indicating whether it is a leaf node, stores the prediction value for classification output, identifies which feature to split on, maintains the split threshold value, and contains pointers to left and right subtrees for values less than or equal to, and greater than the threshold respectively.</w:t>
       </w:r>
     </w:p>
     <w:p>
@@ -1337,10 +1276,7 @@
         <w:pStyle w:val="ListBullet"/>
       </w:pPr>
       <w:r>
-        <w:t xml:space="preserve">Pointer-based nodes </w:t>
-      </w:r>
-      <w:r>
-        <w:t>provide flexibility and memory efficiency</w:t>
+        <w:t>Pointer-based nodes provide flexibility and memory efficiency</w:t>
       </w:r>
     </w:p>
     <w:p>
@@ -1380,10 +1316,7 @@
         <w:pStyle w:val="ListNumber"/>
       </w:pPr>
       <w:r>
-        <w:t>Base Cases: Create leaf nod</w:t>
-      </w:r>
-      <w:r>
-        <w:t>es when all samples have the same label, maximum depth is reached, or there are insufficient samples to split</w:t>
+        <w:t>Base Cases: Create leaf nodes when all samples have the same label, maximum depth is reached, or there are insufficient samples to split</w:t>
       </w:r>
     </w:p>
     <w:p>
@@ -1391,10 +1324,7 @@
         <w:pStyle w:val="ListNumber"/>
       </w:pPr>
       <w:r>
-        <w:t>Information Gain: For each feature, test all possible thresholds and calculate information gain as the difference between parent entropy and weigh</w:t>
-      </w:r>
-      <w:r>
-        <w:t>ted child entropy</w:t>
+        <w:t>Information Gain: For each feature, test all possible thresholds and calculate information gain as the difference between parent entropy and weighted child entropy</w:t>
       </w:r>
     </w:p>
     <w:p>
@@ -1426,10 +1356,7 @@
         <w:pStyle w:val="ListBullet"/>
       </w:pPr>
       <w:r>
-        <w:t xml:space="preserve">Entropy: Measures disorder or </w:t>
-      </w:r>
-      <w:r>
-        <w:t>impurity in the data using the formula H(S) = -Σ p_i * log₂(p_i)</w:t>
+        <w:t>Entropy: Measures disorder or impurity in the data using the formula H(S) = -Σ p_i * log₂(p_i)</w:t>
       </w:r>
     </w:p>
     <w:p>
@@ -1453,21 +1380,12 @@
         <w:rPr>
           <w:b/>
         </w:rPr>
-        <w:t>Pr</w:t>
-      </w:r>
-      <w:r>
-        <w:rPr>
-          <w:b/>
-        </w:rPr>
-        <w:t>ediction Phase:</w:t>
-      </w:r>
-    </w:p>
-    <w:p>
-      <w:r>
-        <w:t>To make a prediction, the algorithm traverses the tree from the root based on feature values. At each node, it checks if the feature value is less than or equal to the threshold to decide whether to follow the left or right branch. When a l</w:t>
-      </w:r>
-      <w:r>
-        <w:t>eaf node is reached, it returns the prediction value stored in that leaf.</w:t>
+        <w:t>Prediction Phase:</w:t>
+      </w:r>
+    </w:p>
+    <w:p>
+      <w:r>
+        <w:t>To make a prediction, the algorithm traverses the tree from the root based on feature values. At each node, it checks if the feature value is less than or equal to the threshold to decide whether to follow the left or right branch. When a leaf node is reached, it returns the prediction value stored in that leaf.</w:t>
       </w:r>
     </w:p>
     <w:p>
@@ -1531,13 +1449,7 @@
     </w:p>
     <w:p>
       <w:r>
-        <w:t>The custom Medic</w:t>
-      </w:r>
-      <w:r>
-        <w:t xml:space="preserve">alHashMap class demonstrates hash table fundamentals using open addressing. Each entry in the hash table contains a key-value pair, along with flags indicating whether the slot is occupied with valid data and whether data was previously deleted (tombstone </w:t>
-      </w:r>
-      <w:r>
-        <w:t>marker for maintaining probe chain integrity).</w:t>
+        <w:t>The custom MedicalHashMap class demonstrates hash table fundamentals using open addressing. Each entry in the hash table contains a key-value pair, along with flags indicating whether the slot is occupied with valid data and whether data was previously deleted (tombstone marker for maintaining probe chain integrity).</w:t>
       </w:r>
     </w:p>
     <w:p>
@@ -1561,10 +1473,7 @@
         <w:pStyle w:val="ListBullet"/>
       </w:pPr>
       <w:r>
-        <w:t xml:space="preserve">Secondary hash function: Uses the sdbm algorithm with modulo m ensuring an odd </w:t>
-      </w:r>
-      <w:r>
-        <w:t>value for better distribution</w:t>
+        <w:t>Secondary hash function: Uses the sdbm algorithm with modulo m ensuring an odd value for better distribution</w:t>
       </w:r>
     </w:p>
     <w:p>
@@ -1785,10 +1694,7 @@
         <w:pStyle w:val="ListBullet"/>
       </w:pPr>
       <w:r>
-        <w:t>Provides better distribution than other collision resoluti</w:t>
-      </w:r>
-      <w:r>
-        <w:t>on methods</w:t>
+        <w:t>Provides better distribution than other collision resolution methods</w:t>
       </w:r>
     </w:p>
     <w:p>
@@ -1835,13 +1741,7 @@
     </w:p>
     <w:p>
       <w:r>
-        <w:t xml:space="preserve">The </w:t>
-      </w:r>
-      <w:r>
-        <w:t>MedicalPriorityQueue implements a max-heap for ranking diseases by risk scores. It uses an array-based structure where each item contains a disease name and its corresponding risk score. The heap maintains parent-child relationships using index calculation</w:t>
-      </w:r>
-      <w:r>
-        <w:t>s: parent is at position (i-1)/2, left child at 2i+1, and right child at 2i+2.</w:t>
+        <w:t>The MedicalPriorityQueue implements a max-heap for ranking diseases by risk scores. It uses an array-based structure where each item contains a disease name and its corresponding risk score. The heap maintains parent-child relationships using index calculations: parent is at position (i-1)/2, left child at 2i+1, and right child at 2i+2.</w:t>
       </w:r>
     </w:p>
     <w:p>
@@ -1854,10 +1754,7 @@
     </w:p>
     <w:p>
       <w:r>
-        <w:t>For every parent node at index i, the heap maintains the property that the parent's risk score is greater than or equal to both its left and right child</w:t>
-      </w:r>
-      <w:r>
-        <w:t>ren's risk scores. This ensures that the highest risk disease is always positioned at the root of the heap.</w:t>
+        <w:t>For every parent node at index i, the heap maintains the property that the parent's risk score is greater than or equal to both its left and right children's risk scores. This ensures that the highest risk disease is always positioned at the root of the heap.</w:t>
       </w:r>
     </w:p>
     <w:p>
@@ -1889,10 +1786,7 @@
         <w:pStyle w:val="ListNumber"/>
       </w:pPr>
       <w:r>
-        <w:t>Bubble up (heapifyUp): While the item is greater than its par</w:t>
-      </w:r>
-      <w:r>
-        <w:t>ent, swap with parent</w:t>
+        <w:t>Bubble up (heapifyUp): While the item is greater than its parent, swap with parent</w:t>
       </w:r>
     </w:p>
     <w:p>
@@ -1932,10 +1826,7 @@
         <w:pStyle w:val="ListNumber"/>
       </w:pPr>
       <w:r>
-        <w:t>Bubble down (heapifyDown): Wh</w:t>
-      </w:r>
-      <w:r>
-        <w:t>ile parent is less than children, swap with the larger child</w:t>
+        <w:t>Bubble down (heapifyDown): While parent is less than children, swap with the larger child</w:t>
       </w:r>
     </w:p>
     <w:p>
@@ -1956,13 +1847,7 @@
     </w:p>
     <w:p>
       <w:r>
-        <w:t xml:space="preserve">When a patient's symptoms match three diseases, the system creates a heap with Heart Disease at </w:t>
-      </w:r>
-      <w:r>
-        <w:t>0.95 risk score, Diabetes at 0.72, and Breast Cancer at 0.31. The doctor then pops diseases in priority order: first Heart Disease (0.95) as the most critical condition requiring immediate attention, then Diabetes (0.72) as a secondary concern, and finally</w:t>
-      </w:r>
-      <w:r>
-        <w:t xml:space="preserve"> Breast Cancer (0.31) with lower priority. This ensures doctors focus on the most critical conditions first.</w:t>
+        <w:t>When a patient's symptoms match three diseases, the system creates a heap with Heart Disease at 0.95 risk score, Diabetes at 0.72, and Breast Cancer at 0.31. The doctor then pops diseases in priority order: first Heart Disease (0.95) as the most critical condition requiring immediate attention, then Diabetes (0.72) as a secondary concern, and finally Breast Cancer (0.31) with lower priority. This ensures doctors focus on the most critical conditions first.</w:t>
       </w:r>
     </w:p>
     <w:p>
@@ -1987,10 +1872,7 @@
     </w:p>
     <w:p>
       <w:r>
-        <w:t>The StringStack implements report history using a dynamic array stru</w:t>
-      </w:r>
-      <w:r>
-        <w:t>cture. It maintains the current array size capacity, a topIndex pointer that points to the next free slot, and a maxSizeLimit to keep only the last N reports (typically 5) for efficient memory management.</w:t>
+        <w:t>The StringStack implements report history using a dynamic array structure. It maintains the current array size capacity, a topIndex pointer that points to the next free slot, and a maxSizeLimit to keep only the last N reports (typically 5) for efficient memory management.</w:t>
       </w:r>
     </w:p>
     <w:p>
@@ -2006,10 +1888,7 @@
         <w:pStyle w:val="ListBullet"/>
       </w:pPr>
       <w:r>
-        <w:t>Push (O(1) amortized): Adds a new report</w:t>
-      </w:r>
-      <w:r>
-        <w:t xml:space="preserve"> to the top of the stack, automatically growing the array if needed by doubling capacity</w:t>
+        <w:t>Push (O(1) amortized): Adds a new report to the top of the stack, automatically growing the array if needed by doubling capacity</w:t>
       </w:r>
     </w:p>
     <w:p>
@@ -2031,16 +1910,7 @@
     </w:p>
     <w:p>
       <w:r>
-        <w:t>Consider a</w:t>
-      </w:r>
-      <w:r>
-        <w:t xml:space="preserve"> patient timeline with three reports: Report_1 from January 15, 2024 with Risk 0.2 (Low), Report_2 from February 20, 2024 with Risk 0.45 (Medium), and Report_3 from March 10, 2024 with Risk 0.75 (High). Using the Stack's LIFO structure, Peek returns Report</w:t>
-      </w:r>
-      <w:r>
-        <w:t>_3 (the most recent diagnosis), Pop removes Report_3 for the doctor to review the most current status, and the next Peek returns Report_2 for comparison. This allows the doctor to immediately see the progression from 0.2 to 0.45 to 0.75, indicating a deter</w:t>
-      </w:r>
-      <w:r>
-        <w:t>iorating condition.</w:t>
+        <w:t>Consider a patient timeline with three reports: Report_1 from January 15, 2024 with Risk 0.2 (Low), Report_2 from February 20, 2024 with Risk 0.45 (Medium), and Report_3 from March 10, 2024 with Risk 0.75 (High). Using the Stack's LIFO structure, Peek returns Report_3 (the most recent diagnosis), Pop removes Report_3 for the doctor to review the most current status, and the next Peek returns Report_2 for comparison. This allows the doctor to immediately see the progression from 0.2 to 0.45 to 0.75, indicating a deteriorating condition.</w:t>
       </w:r>
     </w:p>
     <w:p>
@@ -2071,10 +1941,7 @@
     </w:p>
     <w:p>
       <w:r>
-        <w:t xml:space="preserve">The StringQueue uses a circular buffer implementation with an array buffer, capacity tracking, circular indices for head and tail positions, and a count of </w:t>
-      </w:r>
-      <w:r>
-        <w:t>the number of items currently in the queue.</w:t>
+        <w:t>The StringQueue uses a circular buffer implementation with an array buffer, capacity tracking, circular indices for head and tail positions, and a count of the number of items currently in the queue.</w:t>
       </w:r>
     </w:p>
     <w:p>
@@ -2087,10 +1954,7 @@
     </w:p>
     <w:p>
       <w:r>
-        <w:t xml:space="preserve">Traditional queues waste space when indices move forward. The circular buffer solves this by using modulo arithmetic: tail advances as (tail + 1) modulo capacity on enqueue, and head </w:t>
-      </w:r>
-      <w:r>
-        <w:t>advances as (head + 1) modulo capacity on dequeue. This results in both operations running in O(1) time without any array shifting operations.</w:t>
+        <w:t>Traditional queues waste space when indices move forward. The circular buffer solves this by using modulo arithmetic: tail advances as (tail + 1) modulo capacity on enqueue, and head advances as (head + 1) modulo capacity on dequeue. This results in both operations running in O(1) time without any array shifting operations.</w:t>
       </w:r>
     </w:p>
     <w:p>
@@ -2103,13 +1967,7 @@
     </w:p>
     <w:p>
       <w:r>
-        <w:t xml:space="preserve">In the patient request queue, Patient_A arrives at 09:00, Patient_B </w:t>
-      </w:r>
-      <w:r>
-        <w:t>at 09:15, and Patient_C at 09:30. The doctor processes them in order: Dequeue returns Patient_A (first request, ensuring fair scheduling), then Patient_B, and finally Patient_C. The queue ensures no patient is skipped, maintains FIFO fairness, and achieves</w:t>
-      </w:r>
-      <w:r>
-        <w:t xml:space="preserve"> O(1) operations even with 10,000+ patients in the queue.</w:t>
+        <w:t>In the patient request queue, Patient_A arrives at 09:00, Patient_B at 09:15, and Patient_C at 09:30. The doctor processes them in order: Dequeue returns Patient_A (first request, ensuring fair scheduling), then Patient_B, and finally Patient_C. The queue ensures no patient is skipped, maintains FIFO fairness, and achieves O(1) operations even with 10,000+ patients in the queue.</w:t>
       </w:r>
     </w:p>
     <w:p>
@@ -2302,10 +2160,7 @@
           </w:tcPr>
           <w:p>
             <w:r>
-              <w:t>Heart Dis</w:t>
-            </w:r>
-            <w:r>
-              <w:t>ease</w:t>
+              <w:t>Heart Disease</w:t>
             </w:r>
           </w:p>
         </w:tc>
@@ -2453,10 +2308,7 @@
         <w:pStyle w:val="ListBullet"/>
       </w:pPr>
       <w:r>
-        <w:t xml:space="preserve">Min Samples Split: 2 (minimum samples </w:t>
-      </w:r>
-      <w:r>
-        <w:t>required before splitting a node)</w:t>
+        <w:t>Min Samples Split: 2 (minimum samples required before splitting a node)</w:t>
       </w:r>
     </w:p>
     <w:p>
@@ -2496,10 +2348,7 @@
         <w:pStyle w:val="ListBullet"/>
       </w:pPr>
       <w:r>
-        <w:t>Batch Predictions: P</w:t>
-      </w:r>
-      <w:r>
-        <w:t>rocess 1,000 patients in approximately 200 milliseconds</w:t>
+        <w:t>Batch Predictions: Process 1,000 patients in approximately 200 milliseconds</w:t>
       </w:r>
     </w:p>
     <w:p>
@@ -2539,10 +2388,7 @@
         <w:pStyle w:val="ListBullet"/>
       </w:pPr>
       <w:r>
-        <w:t>1</w:t>
-      </w:r>
-      <w:r>
-        <w:t>,000 patients: Less than 100 milliseconds for all operations</w:t>
+        <w:t>1,000 patients: Less than 100 milliseconds for all operations</w:t>
       </w:r>
     </w:p>
     <w:p>
@@ -2586,10 +2432,7 @@
         <w:pStyle w:val="ListBullet"/>
       </w:pPr>
       <w:r>
-        <w:t>Landing page for</w:t>
-      </w:r>
-      <w:r>
-        <w:t xml:space="preserve"> system introduction</w:t>
+        <w:t>Landing page for system introduction</w:t>
       </w:r>
     </w:p>
     <w:p>
@@ -2637,10 +2480,7 @@
         <w:pStyle w:val="ListBullet"/>
       </w:pPr>
       <w:r>
-        <w:t xml:space="preserve">Report </w:t>
-      </w:r>
-      <w:r>
-        <w:t>history using stack-based retrieval</w:t>
+        <w:t>Report history using stack-based retrieval</w:t>
       </w:r>
     </w:p>
     <w:p>
@@ -2681,10 +2521,7 @@
         <w:pStyle w:val="ListBullet"/>
       </w:pPr>
       <w:r>
-        <w:t>Result Visual</w:t>
-      </w:r>
-      <w:r>
-        <w:t>ization: Charts and risk indicators for clear understanding</w:t>
+        <w:t>Result Visualization: Charts and risk indicators for clear understanding</w:t>
       </w:r>
     </w:p>
     <w:p>
@@ -2738,13 +2575,7 @@
         <w:rPr>
           <w:b/>
         </w:rPr>
-        <w:t>P</w:t>
-      </w:r>
-      <w:r>
-        <w:rPr>
-          <w:b/>
-        </w:rPr>
-        <w:t xml:space="preserve">roblem: </w:t>
+        <w:t xml:space="preserve">Problem: </w:t>
       </w:r>
     </w:p>
     <w:p>
@@ -2773,10 +2604,7 @@
         <w:pStyle w:val="ListBullet"/>
       </w:pPr>
       <w:r>
-        <w:t>Created bindings modul</w:t>
-      </w:r>
-      <w:r>
-        <w:t>e to expose all C++ classes to Python as an importable module</w:t>
+        <w:t>Created bindings module to expose all C++ classes to Python as an importable module</w:t>
       </w:r>
     </w:p>
     <w:p>
@@ -2804,14 +2632,64 @@
           <w:color w:val="003366"/>
           <w:sz w:val="28"/>
         </w:rPr>
-        <w:t>5.2</w:t>
-      </w:r>
+        <w:t>5.2 Custom DSA vs. Standard Library</w:t>
+      </w:r>
+    </w:p>
+    <w:p>
+      <w:r>
+        <w:rPr>
+          <w:b/>
+        </w:rPr>
+        <w:t xml:space="preserve">Problem: </w:t>
+      </w:r>
+    </w:p>
+    <w:p>
+      <w:r>
+        <w:t>Course requirements demand DSA implementation from scratch, but the Standard Template Library provides optimized containers.</w:t>
+      </w:r>
+    </w:p>
+    <w:p>
+      <w:r>
+        <w:rPr>
+          <w:b/>
+        </w:rPr>
+        <w:t>Solutions:</w:t>
+      </w:r>
+    </w:p>
+    <w:p>
+      <w:pPr>
+        <w:pStyle w:val="ListBullet"/>
+      </w:pPr>
+      <w:r>
+        <w:t>Implemented core structures (MedicalHashMap, Stack, Queue, Heap, Graph) completely from scratch</w:t>
+      </w:r>
+    </w:p>
+    <w:p>
+      <w:pPr>
+        <w:pStyle w:val="ListBullet"/>
+      </w:pPr>
+      <w:r>
+        <w:t>Used STL only when absolutely unavoidable such as for std::vector and std::algorithm</w:t>
+      </w:r>
+    </w:p>
+    <w:p>
+      <w:pPr>
+        <w:pStyle w:val="ListBullet"/>
+      </w:pPr>
+      <w:r>
+        <w:t>Custom implementations demonstrate important concepts like collision resolution, load factors, double hashing, and heap operations</w:t>
+      </w:r>
+    </w:p>
+    <w:p>
+      <w:pPr>
+        <w:pStyle w:val="Heading2"/>
+      </w:pPr>
       <w:r>
         <w:rPr>
           <w:color w:val="003366"/>
           <w:sz w:val="28"/>
         </w:rPr>
-        <w:t xml:space="preserve"> Custom DSA vs. Standard Library</w:t>
+        <w:t>5.3 Decision Tree Overfitting</w:t>
       </w:r>
     </w:p>
     <w:p>
@@ -2824,7 +2702,7 @@
     </w:p>
     <w:p>
       <w:r>
-        <w:t>Course requirements demand DSA implementation from scratch, but the Standard Template Library provides optimized containers.</w:t>
+        <w:t>Unrestricted trees can grow too deep, memorizing training data and achieving 100% accuracy but poor generalization to new patients.</w:t>
       </w:r>
     </w:p>
     <w:p>
@@ -2840,10 +2718,7 @@
         <w:pStyle w:val="ListBullet"/>
       </w:pPr>
       <w:r>
-        <w:t xml:space="preserve">Implemented core structures (MedicalHashMap, Stack, Queue, Heap, Graph) </w:t>
-      </w:r>
-      <w:r>
-        <w:t>completely from scratch</w:t>
+        <w:t>Applied Max Depth Constraint to limit tree height to 10 levels</w:t>
       </w:r>
     </w:p>
     <w:p>
@@ -2851,74 +2726,7 @@
         <w:pStyle w:val="ListBullet"/>
       </w:pPr>
       <w:r>
-        <w:t>Used STL only when absolutely unavoidable such as for std::vector and std::algorithm</w:t>
-      </w:r>
-    </w:p>
-    <w:p>
-      <w:pPr>
-        <w:pStyle w:val="ListBullet"/>
-      </w:pPr>
-      <w:r>
-        <w:t>Custom implementations demonstrate important concepts like collision resolution, load factors, double hashing, and heap operations</w:t>
-      </w:r>
-    </w:p>
-    <w:p>
-      <w:pPr>
-        <w:pStyle w:val="Heading2"/>
-      </w:pPr>
-      <w:r>
-        <w:rPr>
-          <w:color w:val="003366"/>
-          <w:sz w:val="28"/>
-        </w:rPr>
-        <w:t>5.3 Decision Tre</w:t>
-      </w:r>
-      <w:r>
-        <w:rPr>
-          <w:color w:val="003366"/>
-          <w:sz w:val="28"/>
-        </w:rPr>
-        <w:t>e Overfitting</w:t>
-      </w:r>
-    </w:p>
-    <w:p>
-      <w:r>
-        <w:rPr>
-          <w:b/>
-        </w:rPr>
-        <w:t xml:space="preserve">Problem: </w:t>
-      </w:r>
-    </w:p>
-    <w:p>
-      <w:r>
-        <w:t>Unrestricted trees can grow too deep, memorizing training data and achieving 100% accuracy but poor generalization to new patients.</w:t>
-      </w:r>
-    </w:p>
-    <w:p>
-      <w:r>
-        <w:rPr>
-          <w:b/>
-        </w:rPr>
-        <w:t>Solutions:</w:t>
-      </w:r>
-    </w:p>
-    <w:p>
-      <w:pPr>
-        <w:pStyle w:val="ListBullet"/>
-      </w:pPr>
-      <w:r>
-        <w:t>Applied Max Depth Constraint to limit tree height to 10 levels</w:t>
-      </w:r>
-    </w:p>
-    <w:p>
-      <w:pPr>
-        <w:pStyle w:val="ListBullet"/>
-      </w:pPr>
-      <w:r>
-        <w:t>Enforced Minimum Samples S</w:t>
-      </w:r>
-      <w:r>
-        <w:t>plit requiring at least 2 samples before splitting a node</w:t>
+        <w:t>Enforced Minimum Samples Split requiring at least 2 samples before splitting a node</w:t>
       </w:r>
     </w:p>
     <w:p>
@@ -2984,10 +2792,7 @@
         <w:pStyle w:val="ListBullet"/>
       </w:pPr>
       <w:r>
-        <w:t>Established role-based access control with different p</w:t>
-      </w:r>
-      <w:r>
-        <w:t>ermissions for Admin, Doctor, and Patient roles</w:t>
+        <w:t>Established role-based access control with different permissions for Admin, Doctor, and Patient roles</w:t>
       </w:r>
     </w:p>
     <w:p>
@@ -3028,10 +2833,7 @@
     </w:p>
     <w:p>
       <w:r>
-        <w:t>Symptom-disease relationships c</w:t>
-      </w:r>
-      <w:r>
-        <w:t>an be complex with many edges. System needs fast queries like finding diseases that cause specific symptoms.</w:t>
+        <w:t>Symptom-disease relationships can be complex with many edges. System needs fast queries like finding diseases that cause specific symptoms.</w:t>
       </w:r>
     </w:p>
     <w:p>
@@ -3055,10 +2857,7 @@
         <w:pStyle w:val="ListBullet"/>
       </w:pPr>
       <w:r>
-        <w:t xml:space="preserve">Implemented Directed Edges from Symptom to Disease (not bidirectional) to </w:t>
-      </w:r>
-      <w:r>
-        <w:t>reduce edge count</w:t>
+        <w:t>Implemented Directed Edges from Symptom to Disease (not bidirectional) to reduce edge count</w:t>
       </w:r>
     </w:p>
     <w:p>
@@ -3099,10 +2898,7 @@
     </w:p>
     <w:p>
       <w:r>
-        <w:t xml:space="preserve">Real datasets contain missing values, out-of-range entries, </w:t>
-      </w:r>
-      <w:r>
-        <w:t>and type mismatches that need robust handling.</w:t>
+        <w:t>Real datasets contain missing values, out-of-range entries, and type mismatches that need robust handling.</w:t>
       </w:r>
     </w:p>
     <w:p>
@@ -3134,10 +2930,7 @@
         <w:pStyle w:val="ListBullet"/>
       </w:pPr>
       <w:r>
-        <w:t>Added Backend V</w:t>
-      </w:r>
-      <w:r>
-        <w:t>alidation to re-validate all inputs server-side as a security measure</w:t>
+        <w:t>Added Backend Validation to re-validate all inputs server-side as a security measure</w:t>
       </w:r>
     </w:p>
     <w:p>
@@ -3171,10 +2964,7 @@
     <w:p>
       <w:r>
         <w:lastRenderedPageBreak/>
-        <w:t>Adding new diseases causes significant code duplication as each disease needs diff</w:t>
-      </w:r>
-      <w:r>
-        <w:t>erent models, features, and thresholds.</w:t>
+        <w:t>Adding new diseases causes significant code duplication as each disease needs different models, features, and thresholds.</w:t>
       </w:r>
     </w:p>
     <w:p>
@@ -3206,10 +2996,7 @@
         <w:pStyle w:val="ListBullet"/>
       </w:pPr>
       <w:r>
-        <w:t>Built Unified En</w:t>
-      </w:r>
-      <w:r>
-        <w:t>gine where single prediction_engine.py works for all diseases</w:t>
+        <w:t>Built Unified Engine where single prediction_engine.py works for all diseases</w:t>
       </w:r>
     </w:p>
     <w:p>
@@ -3242,10 +3029,7 @@
     </w:p>
     <w:p>
       <w:r>
-        <w:t>Naive queue implementation shifts elements on dequeue, resulti</w:t>
-      </w:r>
-      <w:r>
-        <w:t>ng in O(n) operation and causing performance degradation with high-frequency operations.</w:t>
+        <w:t>Naive queue implementation shifts elements on dequeue, resulting in O(n) operation and causing performance degradation with high-frequency operations.</w:t>
       </w:r>
     </w:p>
     <w:p>
@@ -3269,10 +3053,7 @@
         <w:pStyle w:val="ListBullet"/>
       </w:pPr>
       <w:r>
-        <w:t>Applied Modulo Arithmetic where head advances as (head + 1) modulo c</w:t>
-      </w:r>
-      <w:r>
-        <w:t>apacity on dequeue</w:t>
+        <w:t>Applied Modulo Arithmetic where head advances as (head + 1) modulo capacity on dequeue</w:t>
       </w:r>
     </w:p>
     <w:p>
@@ -3313,10 +3094,7 @@
     </w:p>
     <w:p>
       <w:r>
-        <w:t>Decision tree provides binary output (0 or 1), but real med</w:t>
-      </w:r>
-      <w:r>
-        <w:t>ical decisions require nuanced risk levels.</w:t>
+        <w:t>Decision tree provides binary output (0 or 1), but real medical decisions require nuanced risk levels.</w:t>
       </w:r>
     </w:p>
     <w:p>
@@ -3394,10 +3172,7 @@
         <w:pStyle w:val="ListBullet"/>
       </w:pPr>
       <w:r>
-        <w:t>Ensemble Methods: Implement Random Fore</w:t>
-      </w:r>
-      <w:r>
-        <w:t>st, Gradient Boosting, and AdaBoost for improved accuracy</w:t>
+        <w:t>Ensemble Methods: Implement Random Forest, Gradient Boosting, and AdaBoost for improved accuracy</w:t>
       </w:r>
     </w:p>
     <w:p>
@@ -3433,10 +3208,7 @@
         <w:pStyle w:val="ListBullet"/>
       </w:pPr>
       <w:r>
-        <w:t>B-Tree for Datab</w:t>
-      </w:r>
-      <w:r>
-        <w:t>ase Indexing: Enable logarithmic lookup with millions of records</w:t>
+        <w:t>B-Tree for Database Indexing: Enable logarithmic lookup with millions of records</w:t>
       </w:r>
     </w:p>
     <w:p>
@@ -3460,10 +3232,7 @@
         <w:pStyle w:val="ListBullet"/>
       </w:pPr>
       <w:r>
-        <w:t xml:space="preserve">AVL Trees: Implement self-balancing </w:t>
-      </w:r>
-      <w:r>
-        <w:t>BST ensuring O(log n) guaranteed performance</w:t>
+        <w:t>AVL Trees: Implement self-balancing BST ensuring O(log n) guaranteed performance</w:t>
       </w:r>
     </w:p>
     <w:p>
@@ -3499,10 +3268,7 @@
         <w:pStyle w:val="ListBullet"/>
       </w:pPr>
       <w:r>
-        <w:t>Ca</w:t>
-      </w:r>
-      <w:r>
-        <w:t>ching Layer: Cache frequently accessed thresholds using LRU cache strategy</w:t>
+        <w:t>Caching Layer: Cache frequently accessed thresholds using LRU cache strategy</w:t>
       </w:r>
     </w:p>
     <w:p>
@@ -3530,10 +3296,7 @@
         <w:pStyle w:val="ListBullet"/>
       </w:pPr>
       <w:r>
-        <w:t>Dynamic</w:t>
-      </w:r>
-      <w:r>
-        <w:t xml:space="preserve"> Programming: Optimize complex prediction workflows</w:t>
+        <w:t>Dynamic Programming: Optimize complex prediction workflows</w:t>
       </w:r>
     </w:p>
     <w:p>
@@ -3569,10 +3332,7 @@
         <w:pStyle w:val="ListBullet"/>
       </w:pPr>
       <w:r>
-        <w:t>Interacti</w:t>
-      </w:r>
-      <w:r>
-        <w:t>ve Visualization: Integrate Charts.js for risk score curves and probability visualization</w:t>
+        <w:t>Interactive Visualization: Integrate Charts.js for risk score curves and probability visualization</w:t>
       </w:r>
     </w:p>
     <w:p>
@@ -3600,14 +3360,7 @@
           <w:color w:val="003366"/>
           <w:sz w:val="28"/>
         </w:rPr>
-        <w:t xml:space="preserve">6.6 </w:t>
-      </w:r>
-      <w:r>
-        <w:rPr>
-          <w:color w:val="003366"/>
-          <w:sz w:val="28"/>
-        </w:rPr>
-        <w:t>Security &amp; Privacy</w:t>
+        <w:t>6.6 Security &amp; Privacy</w:t>
       </w:r>
     </w:p>
     <w:p>
@@ -3631,10 +3384,7 @@
         <w:pStyle w:val="ListBullet"/>
       </w:pPr>
       <w:r>
-        <w:t>Federated Learning: Train models on-device without uploading sensitive da</w:t>
-      </w:r>
-      <w:r>
-        <w:t>ta</w:t>
+        <w:t>Federated Learning: Train models on-device without uploading sensitive data</w:t>
       </w:r>
     </w:p>
     <w:p>
@@ -3671,10 +3421,7 @@
       </w:pPr>
       <w:r>
         <w:lastRenderedPageBreak/>
-        <w:t>Explainable AI (XAI): Provide clear explanations for tree decisi</w:t>
-      </w:r>
-      <w:r>
-        <w:t>ons to increase trust</w:t>
+        <w:t>Explainable AI (XAI): Provide clear explanations for tree decisions to increase trust</w:t>
       </w:r>
     </w:p>
     <w:p>
@@ -3713,13 +3460,7 @@
     </w:p>
     <w:p>
       <w:r>
-        <w:t>VitaCare Pro successfully demonstrate</w:t>
-      </w:r>
-      <w:r>
-        <w:t>s the critical role of Data Structures and Algorithms in modern medical software systems. By implementing custom DSA structures in C++ and integrating them with a Python web application, this project showcases several key achievements and important lessons</w:t>
-      </w:r>
-      <w:r>
-        <w:t>.</w:t>
+        <w:t>VitaCare Pro successfully demonstrates the critical role of Data Structures and Algorithms in modern medical software systems. By implementing custom DSA structures in C++ and integrating them with a Python web application, this project showcases several key achievements and important lessons.</w:t>
       </w:r>
     </w:p>
     <w:p>
@@ -3755,10 +3496,7 @@
         <w:pStyle w:val="ListBullet"/>
       </w:pPr>
       <w:r>
-        <w:t>Scalab</w:t>
-      </w:r>
-      <w:r>
-        <w:t>le Architecture: Support for thousands of patients with sub-millisecond prediction times</w:t>
+        <w:t>Scalable Architecture: Support for thousands of patients with sub-millisecond prediction times</w:t>
       </w:r>
     </w:p>
     <w:p>
@@ -3774,10 +3512,7 @@
         <w:pStyle w:val="ListBullet"/>
       </w:pPr>
       <w:r>
-        <w:t>Educational Value: Clear demonstrations of sorting, searchi</w:t>
-      </w:r>
-      <w:r>
-        <w:t>ng, graph traversal, and advanced algorithms</w:t>
+        <w:t>Educational Value: Clear demonstrations of sorting, searching, graph traversal, and advanced algorithms</w:t>
       </w:r>
     </w:p>
     <w:p>
@@ -3805,10 +3540,7 @@
         <w:pStyle w:val="ListBullet"/>
       </w:pPr>
       <w:r>
-        <w:t>Right Tool for the Job: Custom implementations sometimes outperform generic libr</w:t>
-      </w:r>
-      <w:r>
-        <w:t>aries in specific use cases</w:t>
+        <w:t>Right Tool for the Job: Custom implementations sometimes outperform generic libraries in specific use cases</w:t>
       </w:r>
     </w:p>
     <w:p>
@@ -3832,10 +3564,7 @@
         <w:pStyle w:val="ListBullet"/>
       </w:pPr>
       <w:r>
-        <w:t>Continuou</w:t>
-      </w:r>
-      <w:r>
-        <w:t>s Improvement: Systems must evolve with new algorithms, ML techniques, and security standards</w:t>
+        <w:t>Continuous Improvement: Systems must evolve with new algorithms, ML techniques, and security standards</w:t>
       </w:r>
     </w:p>
     <w:p>
@@ -3852,23 +3581,14 @@
     </w:p>
     <w:p>
       <w:r>
-        <w:t>The system is production-ready for small-to-medium medical facilities and provides an excellent foundation for further research and enhancement in medi</w:t>
-      </w:r>
-      <w:r>
-        <w:t>cal diagnosis support systems. The integration of custom DSA implementations with modern web technologies demonstrates that fundamental computer science concepts remain relevant and powerful in solving real-world problems.</w:t>
+        <w:t>The system is production-ready for small-to-medium medical facilities and provides an excellent foundation for further research and enhancement in medical diagnosis support systems. The integration of custom DSA implementations with modern web technologies demonstrates that fundamental computer science concepts remain relevant and powerful in solving real-world problems.</w:t>
       </w:r>
       <w:r>
         <w:br/>
       </w:r>
       <w:r>
         <w:br/>
-        <w:t>This project not only fulfills t</w:t>
-      </w:r>
-      <w:r>
-        <w:t>he educational objectives of demonstrating DSA concepts but also delivers a practical, usable system that could genuinely benefit healthcare providers and patients. The careful balance between theoretical correctness and practical implementation makes Vita</w:t>
-      </w:r>
-      <w:r>
-        <w:t>Care Pro a compelling example of applied computer science in the medical domain.</w:t>
+        <w:t>This project not only fulfills the educational objectives of demonstrating DSA concepts but also delivers a practical, usable system that could genuinely benefit healthcare providers and patients. The careful balance between theoretical correctness and practical implementation makes VitaCare Pro a compelling example of applied computer science in the medical domain.</w:t>
       </w:r>
     </w:p>
     <w:p/>
@@ -3882,20 +3602,38 @@
           <w:i/>
           <w:sz w:val="20"/>
         </w:rPr>
-        <w:t>Project Repository: Multi-Disease-Detect-Support-System</w:t>
-      </w:r>
-    </w:p>
-    <w:p>
-      <w:pPr>
-        <w:jc w:val="center"/>
-      </w:pPr>
+        <w:t xml:space="preserve">Project Repository: </w:t>
+      </w:r>
+      <w:proofErr w:type="spellStart"/>
       <w:r>
         <w:rPr>
           <w:i/>
           <w:sz w:val="20"/>
         </w:rPr>
-        <w:t>GitHub: abdulrafay1402/Multi-Disease-Detect-Support-System</w:t>
-      </w:r>
+        <w:t>VitaCare.Pro</w:t>
+      </w:r>
+      <w:proofErr w:type="spellEnd"/>
+    </w:p>
+    <w:p>
+      <w:pPr>
+        <w:jc w:val="center"/>
+      </w:pPr>
+      <w:r>
+        <w:rPr>
+          <w:i/>
+          <w:sz w:val="20"/>
+        </w:rPr>
+        <w:t>GitHub: abdulrafay1402/</w:t>
+      </w:r>
+      <w:r>
+        <w:rPr>
+          <w:i/>
+          <w:sz w:val="20"/>
+        </w:rPr>
+        <w:t>VitaCare.Pro</w:t>
+      </w:r>
+      <w:bookmarkStart w:id="0" w:name="_GoBack"/>
+      <w:bookmarkEnd w:id="0"/>
     </w:p>
     <w:p/>
     <w:p>
@@ -3908,15 +3646,7 @@
           <w:color w:val="646464"/>
           <w:sz w:val="18"/>
         </w:rPr>
-        <w:t xml:space="preserve">This report was prepared as part of the Data Structures </w:t>
-      </w:r>
-      <w:r>
-        <w:rPr>
-          <w:i/>
-          <w:color w:val="646464"/>
-          <w:sz w:val="18"/>
-        </w:rPr>
-        <w:t>and Algorithms course project, demonstrating practical application of DSA concepts in a real-world medical system.</w:t>
+        <w:t>This report was prepared as part of the Data Structures and Algorithms course project, demonstrating practical application of DSA concepts in a real-world medical system.</w:t>
       </w:r>
     </w:p>
     <w:sectPr>
@@ -15838,7 +15568,7 @@
 </file>
 
 <file path=customXml/itemProps1.xml><?xml version="1.0" encoding="utf-8"?>
-<ds:datastoreItem xmlns:ds="http://schemas.openxmlformats.org/officeDocument/2006/customXml" ds:itemID="{031D78F8-5A3C-42DF-BA3A-3026A32D93B4}">
+<ds:datastoreItem xmlns:ds="http://schemas.openxmlformats.org/officeDocument/2006/customXml" ds:itemID="{9E312ABC-25E7-4B2B-8503-3E8E5F865CCE}">
   <ds:schemaRefs>
     <ds:schemaRef ds:uri="http://schemas.openxmlformats.org/officeDocument/2006/bibliography"/>
   </ds:schemaRefs>

</xml_diff>